<commit_message>
cambios significativos en la web de artistas
</commit_message>
<xml_diff>
--- a/Memoria trabajo final Alicia Abascal.docx
+++ b/Memoria trabajo final Alicia Abascal.docx
@@ -32,13 +32,19 @@
       </w:r>
     </w:p>
     <w:p>
+      <w:r>
+        <w:t>No consigo que el formulario se vacie al “enviarlo”.</w:t>
+      </w:r>
+    </w:p>
+    <w:p/>
+    <w:p>
       <w:pPr>
         <w:rPr>
           <w:u w:val="single"/>
         </w:rPr>
       </w:pPr>
       <w:r>
-        <w:t>No consigo que el formulario se vacie al “enviarlo”.</w:t>
+        <w:t>Como no quiero tener veinte js busco una forma de que, al no detectar un elemento no se bloquee el java que no sea try and catch. Lo encapsulo en funciones que van siendo llamadas al cargar el documento.</w:t>
       </w:r>
     </w:p>
     <w:sectPr>

</xml_diff>